<commit_message>
Art. 4.6: limite di un solo scambio per giocatore per stagione
Co-Authored-By: Claude Opus 5.5 <noreply@anthropic.com>
</commit_message>
<xml_diff>
--- a/originali/Regolamento Fantacluster 2026-2027.docx
+++ b/originali/Regolamento Fantacluster 2026-2027.docx
@@ -3740,7 +3740,7 @@
           <w:szCs w:val="20"/>
           <w:lang w:val="it-IT"/>
         </w:rPr>
-        <w:t xml:space="preserve"> tra squadre durante l’asta, ma tali scambi possono avvenire solo tra una chiamata e l’altra. Ogni giocatore può essere oggetto di un massimo di un solo scambio durante l'asta. </w:t>
+        <w:t xml:space="preserve"> tra squadre durante l’asta, ma tali scambi possono avvenire solo tra una chiamata e l’altra. </w:t>
       </w:r>
       <w:r>
         <w:rPr>
@@ -3772,7 +3772,7 @@
           <w:szCs w:val="20"/>
           <w:lang w:val="it-IT"/>
         </w:rPr>
-        <w:t xml:space="preserve"> di giocatori durante questo periodo.</w:t>
+        <w:t xml:space="preserve"> di giocatori durante questo periodo. Ogni giocatore può essere oggetto di un solo scambio per stagione, asta compresa, anche nell'ambito di scambi multipli; torna scambiabile solo in caso di svincolo.</w:t>
       </w:r>
     </w:p>
     <w:p>

</xml_diff>